<commit_message>
Atualização do documento do projeto
</commit_message>
<xml_diff>
--- a/ProgramacaoInternet/Projeto/Documentos/VetCare_Projeto-Corporativo.docx
+++ b/ProgramacaoInternet/Projeto/Documentos/VetCare_Projeto-Corporativo.docx
@@ -215,42 +215,19 @@
         <w:rPr>
           <w:rFonts w:ascii="Arial" w:hAnsi="Arial" w:cs="Arial"/>
         </w:rPr>
-        <w:t xml:space="preserve">Início: </w:t>
-      </w:r>
-      <w:r>
-        <w:rPr>
-          <w:rFonts w:ascii="Arial" w:hAnsi="Arial" w:cs="Arial"/>
-          <w:color w:val="0000FF"/>
-        </w:rPr>
-        <w:t>[</w:t>
-      </w:r>
-      <w:r>
-        <w:rPr>
-          <w:rFonts w:ascii="Arial" w:hAnsi="Arial" w:cs="Arial"/>
-          <w:color w:val="0000FF"/>
-        </w:rPr>
-        <w:t>MM</w:t>
-      </w:r>
-      <w:r>
-        <w:rPr>
-          <w:rFonts w:ascii="Arial" w:hAnsi="Arial" w:cs="Arial"/>
-          <w:color w:val="0000FF"/>
-        </w:rPr>
-        <w:t>/</w:t>
-      </w:r>
-      <w:r>
-        <w:rPr>
-          <w:rFonts w:ascii="Arial" w:hAnsi="Arial" w:cs="Arial"/>
-          <w:color w:val="0000FF"/>
-        </w:rPr>
-        <w:t>AAAA</w:t>
-      </w:r>
-      <w:r>
-        <w:rPr>
-          <w:rFonts w:ascii="Arial" w:hAnsi="Arial" w:cs="Arial"/>
-          <w:color w:val="0000FF"/>
-        </w:rPr>
-        <w:t>]</w:t>
+        <w:t>Início</w:t>
+      </w:r>
+      <w:r>
+        <w:rPr>
+          <w:rFonts w:ascii="Arial" w:hAnsi="Arial" w:cs="Arial"/>
+        </w:rPr>
+        <w:t xml:space="preserve">: </w:t>
+      </w:r>
+      <w:r>
+        <w:rPr>
+          <w:rFonts w:ascii="Arial" w:hAnsi="Arial" w:cs="Arial"/>
+        </w:rPr>
+        <w:t>08/2026</w:t>
       </w:r>
     </w:p>
     <w:p>
@@ -400,26 +377,9 @@
       <w:r>
         <w:rPr>
           <w:rFonts w:ascii="Arial" w:hAnsi="Arial" w:cs="Arial"/>
-          <w:color w:val="0000FF"/>
           <w:sz w:val="20"/>
         </w:rPr>
-        <w:t>[</w:t>
-      </w:r>
-      <w:r>
-        <w:rPr>
-          <w:rFonts w:ascii="Arial" w:hAnsi="Arial" w:cs="Arial"/>
-          <w:color w:val="0000FF"/>
-          <w:sz w:val="20"/>
-        </w:rPr>
-        <w:t>Componente 1</w:t>
-      </w:r>
-      <w:r>
-        <w:rPr>
-          <w:rFonts w:ascii="Arial" w:hAnsi="Arial" w:cs="Arial"/>
-          <w:color w:val="0000FF"/>
-          <w:sz w:val="20"/>
-        </w:rPr>
-        <w:t>]</w:t>
+        <w:t>Andre Lima</w:t>
       </w:r>
     </w:p>
     <w:p>
@@ -437,26 +397,9 @@
       <w:r>
         <w:rPr>
           <w:rFonts w:ascii="Arial" w:hAnsi="Arial" w:cs="Arial"/>
-          <w:color w:val="0000FF"/>
           <w:sz w:val="20"/>
         </w:rPr>
-        <w:t>[</w:t>
-      </w:r>
-      <w:r>
-        <w:rPr>
-          <w:rFonts w:ascii="Arial" w:hAnsi="Arial" w:cs="Arial"/>
-          <w:color w:val="0000FF"/>
-          <w:sz w:val="20"/>
-        </w:rPr>
-        <w:t>Componente 2</w:t>
-      </w:r>
-      <w:r>
-        <w:rPr>
-          <w:rFonts w:ascii="Arial" w:hAnsi="Arial" w:cs="Arial"/>
-          <w:color w:val="0000FF"/>
-          <w:sz w:val="20"/>
-        </w:rPr>
-        <w:t>]</w:t>
+        <w:t>Lucas Sousa</w:t>
       </w:r>
     </w:p>
     <w:p>
@@ -474,93 +417,10 @@
       <w:r>
         <w:rPr>
           <w:rFonts w:ascii="Arial" w:hAnsi="Arial" w:cs="Arial"/>
-          <w:color w:val="0000FF"/>
           <w:sz w:val="20"/>
         </w:rPr>
-        <w:t>[</w:t>
-      </w:r>
-      <w:r>
-        <w:rPr>
-          <w:rFonts w:ascii="Arial" w:hAnsi="Arial" w:cs="Arial"/>
-          <w:color w:val="0000FF"/>
-          <w:sz w:val="20"/>
-        </w:rPr>
-        <w:t>Componente 3</w:t>
-      </w:r>
-      <w:r>
-        <w:rPr>
-          <w:rFonts w:ascii="Arial" w:hAnsi="Arial" w:cs="Arial"/>
-          <w:color w:val="0000FF"/>
-          <w:sz w:val="20"/>
-        </w:rPr>
-        <w:t>]</w:t>
-      </w:r>
-    </w:p>
-    <w:p>
-      <w:pPr>
-        <w:pBdr>
-          <w:bottom w:val="single" w:sz="4" w:space="1" w:color="000000"/>
-        </w:pBdr>
-        <w:jc w:val="right"/>
-        <w:rPr>
-          <w:rFonts w:ascii="Arial" w:hAnsi="Arial" w:cs="Arial"/>
-          <w:color w:val="0000FF"/>
-          <w:sz w:val="20"/>
-        </w:rPr>
-      </w:pPr>
-      <w:r>
-        <w:rPr>
-          <w:rFonts w:ascii="Arial" w:hAnsi="Arial" w:cs="Arial"/>
-          <w:color w:val="0000FF"/>
-          <w:sz w:val="20"/>
-        </w:rPr>
-        <w:t>[</w:t>
-      </w:r>
-      <w:r>
-        <w:rPr>
-          <w:rFonts w:ascii="Arial" w:hAnsi="Arial" w:cs="Arial"/>
-          <w:color w:val="0000FF"/>
-          <w:sz w:val="20"/>
-        </w:rPr>
-        <w:t>Componente 4</w:t>
-      </w:r>
-      <w:r>
-        <w:rPr>
-          <w:rFonts w:ascii="Arial" w:hAnsi="Arial" w:cs="Arial"/>
-          <w:color w:val="0000FF"/>
-          <w:sz w:val="20"/>
-        </w:rPr>
-        <w:t>]</w:t>
-      </w:r>
-    </w:p>
-    <w:p>
-      <w:pPr>
-        <w:pBdr>
-          <w:bottom w:val="single" w:sz="4" w:space="1" w:color="000000"/>
-        </w:pBdr>
-        <w:jc w:val="right"/>
-        <w:rPr>
-          <w:rFonts w:ascii="Arial" w:hAnsi="Arial" w:cs="Arial"/>
-          <w:color w:val="0000FF"/>
-          <w:sz w:val="20"/>
-        </w:rPr>
-      </w:pPr>
-      <w:r>
-        <w:rPr>
-          <w:rFonts w:ascii="Arial" w:hAnsi="Arial" w:cs="Arial"/>
-          <w:color w:val="0000FF"/>
-          <w:sz w:val="20"/>
-        </w:rPr>
-        <w:t>[Componente 5]</w:t>
-      </w:r>
-    </w:p>
-    <w:p>
-      <w:pPr>
-        <w:pStyle w:val="Cabealho"/>
-        <w:rPr>
-          <w:rFonts w:ascii="Arial" w:hAnsi="Arial" w:cs="Arial"/>
-        </w:rPr>
-      </w:pPr>
+        <w:t>Isaac Lima</w:t>
+      </w:r>
     </w:p>
     <w:p>
       <w:pPr>
@@ -5470,8 +5330,6 @@
       </w:pPr>
       <w:bookmarkStart w:id="3" w:name="_Toc238486919"/>
       <w:bookmarkStart w:id="4" w:name="_Toc238747128"/>
-      <w:proofErr w:type="spellStart"/>
-      <w:proofErr w:type="gramStart"/>
       <w:r>
         <w:rPr>
           <w:rFonts w:ascii="Arial" w:hAnsi="Arial"/>
@@ -5481,8 +5339,6 @@
       </w:r>
       <w:bookmarkEnd w:id="3"/>
       <w:bookmarkEnd w:id="4"/>
-      <w:proofErr w:type="spellEnd"/>
-      <w:proofErr w:type="gramEnd"/>
     </w:p>
     <w:p>
       <w:pPr>
@@ -5535,8 +5391,6 @@
       </w:pPr>
       <w:bookmarkStart w:id="5" w:name="_Toc238486920"/>
       <w:bookmarkStart w:id="6" w:name="_Toc238747129"/>
-      <w:proofErr w:type="spellStart"/>
-      <w:proofErr w:type="gramStart"/>
       <w:r>
         <w:rPr>
           <w:rFonts w:ascii="Arial" w:hAnsi="Arial"/>
@@ -5546,8 +5400,6 @@
       </w:r>
       <w:bookmarkEnd w:id="5"/>
       <w:bookmarkEnd w:id="6"/>
-      <w:proofErr w:type="spellEnd"/>
-      <w:proofErr w:type="gramEnd"/>
     </w:p>
     <w:p>
       <w:pPr>
@@ -5603,8 +5455,6 @@
           <w:b/>
         </w:rPr>
       </w:pPr>
-      <w:proofErr w:type="spellStart"/>
-      <w:proofErr w:type="gramStart"/>
       <w:r>
         <w:rPr>
           <w:rFonts w:ascii="Arial" w:hAnsi="Arial"/>
@@ -5612,8 +5462,6 @@
         </w:rPr>
         <w:t>Sub-item</w:t>
       </w:r>
-      <w:proofErr w:type="spellEnd"/>
-      <w:proofErr w:type="gramEnd"/>
     </w:p>
     <w:p>
       <w:pPr>
@@ -5848,7 +5696,6 @@
         </w:rPr>
         <w:t xml:space="preserve">Prof. </w:t>
       </w:r>
-      <w:proofErr w:type="spellStart"/>
       <w:r>
         <w:rPr>
           <w:rFonts w:ascii="Arial" w:hAnsi="Arial" w:cs="Arial"/>
@@ -5857,31 +5704,8 @@
           <w:sz w:val="20"/>
           <w:szCs w:val="20"/>
         </w:rPr>
-        <w:t>Rodinei</w:t>
-      </w:r>
-      <w:proofErr w:type="spellEnd"/>
-      <w:r>
-        <w:rPr>
-          <w:rFonts w:ascii="Arial" w:hAnsi="Arial" w:cs="Arial"/>
-          <w:b/>
-          <w:bCs/>
-          <w:sz w:val="20"/>
-          <w:szCs w:val="20"/>
-        </w:rPr>
-        <w:t xml:space="preserve"> </w:t>
-      </w:r>
-      <w:proofErr w:type="spellStart"/>
-      <w:r>
-        <w:rPr>
-          <w:rFonts w:ascii="Arial" w:hAnsi="Arial" w:cs="Arial"/>
-          <w:b/>
-          <w:bCs/>
-          <w:sz w:val="20"/>
-          <w:szCs w:val="20"/>
-        </w:rPr>
-        <w:t>Pontelli</w:t>
-      </w:r>
-      <w:proofErr w:type="spellEnd"/>
+        <w:t>Rodinei Pontelli</w:t>
+      </w:r>
     </w:p>
     <w:p>
       <w:pPr>
@@ -6174,8 +5998,6 @@
       </w:pPr>
       <w:bookmarkStart w:id="9" w:name="_Toc238486922"/>
       <w:bookmarkStart w:id="10" w:name="_Toc238747131"/>
-      <w:proofErr w:type="spellStart"/>
-      <w:proofErr w:type="gramStart"/>
       <w:r>
         <w:rPr>
           <w:rFonts w:ascii="Arial" w:hAnsi="Arial"/>
@@ -6185,8 +6007,6 @@
       </w:r>
       <w:bookmarkEnd w:id="9"/>
       <w:bookmarkEnd w:id="10"/>
-      <w:proofErr w:type="spellEnd"/>
-      <w:proofErr w:type="gramEnd"/>
     </w:p>
     <w:p>
       <w:pPr>
@@ -6239,8 +6059,6 @@
       </w:pPr>
       <w:bookmarkStart w:id="11" w:name="_Toc238486923"/>
       <w:bookmarkStart w:id="12" w:name="_Toc238747132"/>
-      <w:proofErr w:type="spellStart"/>
-      <w:proofErr w:type="gramStart"/>
       <w:r>
         <w:rPr>
           <w:rFonts w:ascii="Arial" w:hAnsi="Arial"/>
@@ -6250,8 +6068,6 @@
       </w:r>
       <w:bookmarkEnd w:id="11"/>
       <w:bookmarkEnd w:id="12"/>
-      <w:proofErr w:type="spellEnd"/>
-      <w:proofErr w:type="gramEnd"/>
     </w:p>
     <w:p>
       <w:pPr>
@@ -6743,8 +6559,6 @@
         <w:jc w:val="both"/>
         <w:rPr>
           <w:rFonts w:ascii="Arial" w:hAnsi="Arial" w:cs="Arial"/>
-          <w:i/>
-          <w:color w:val="0000FF"/>
         </w:rPr>
       </w:pPr>
       <w:bookmarkStart w:id="14" w:name="_Toc68452623"/>
@@ -6760,24 +6574,6 @@
       <w:r>
         <w:rPr>
           <w:rFonts w:ascii="Arial" w:hAnsi="Arial" w:cs="Arial"/>
-          <w:i/>
-          <w:color w:val="0000FF"/>
-        </w:rPr>
-        <w:t>[Este espaço deve ser usado para descrever os objetivos deste documento e o público ao qual ele se destina. Complete e/ou adapte o texto abaixo para fornecer essas informações.]</w:t>
-      </w:r>
-    </w:p>
-    <w:p>
-      <w:pPr>
-        <w:spacing w:line="360" w:lineRule="auto"/>
-        <w:ind w:left="426"/>
-        <w:jc w:val="both"/>
-        <w:rPr>
-          <w:rFonts w:ascii="Arial" w:hAnsi="Arial" w:cs="Arial"/>
-        </w:rPr>
-      </w:pPr>
-      <w:r>
-        <w:rPr>
-          <w:rFonts w:ascii="Arial" w:hAnsi="Arial" w:cs="Arial"/>
         </w:rPr>
         <w:t xml:space="preserve">Este documento especifica </w:t>
       </w:r>
@@ -6814,26 +6610,20 @@
       <w:r>
         <w:rPr>
           <w:rFonts w:ascii="Arial" w:hAnsi="Arial" w:cs="Arial"/>
-          <w:i/>
-          <w:color w:val="0000FF"/>
-        </w:rPr>
-        <w:t>[</w:t>
-      </w:r>
-      <w:r>
-        <w:rPr>
-          <w:rFonts w:ascii="Arial" w:hAnsi="Arial" w:cs="Arial"/>
-          <w:i/>
-          <w:color w:val="0000FF"/>
-        </w:rPr>
-        <w:t>XXXXX</w:t>
-      </w:r>
-      <w:r>
-        <w:rPr>
-          <w:rFonts w:ascii="Arial" w:hAnsi="Arial" w:cs="Arial"/>
-          <w:i/>
-          <w:color w:val="0000FF"/>
-        </w:rPr>
-        <w:t>]</w:t>
+        </w:rPr>
+        <w:t>VC-</w:t>
+      </w:r>
+      <w:r>
+        <w:rPr>
+          <w:rFonts w:ascii="Arial" w:hAnsi="Arial" w:cs="Arial"/>
+        </w:rPr>
+        <w:t>V</w:t>
+      </w:r>
+      <w:r>
+        <w:rPr>
+          <w:rFonts w:ascii="Arial" w:hAnsi="Arial" w:cs="Arial"/>
+        </w:rPr>
+        <w:t>CN (VetCare - Vacinas)</w:t>
       </w:r>
       <w:r>
         <w:rPr>
@@ -6933,9 +6723,7 @@
         <w:jc w:val="both"/>
         <w:rPr>
           <w:rFonts w:ascii="Arial" w:hAnsi="Arial" w:cs="Arial"/>
-          <w:i/>
-          <w:iCs/>
-          <w:color w:val="0000FF"/>
+          <w:highlight w:val="yellow"/>
         </w:rPr>
       </w:pPr>
       <w:bookmarkStart w:id="25" w:name="_Toc68452624"/>
@@ -6951,70 +6739,30 @@
       <w:r>
         <w:rPr>
           <w:rFonts w:ascii="Arial" w:hAnsi="Arial" w:cs="Arial"/>
-          <w:i/>
-          <w:iCs/>
-          <w:color w:val="0000FF"/>
-        </w:rPr>
-        <w:t>[Esta seção fornece uma breve descrição de como o resto deste documento está organizado. Complete e/ou adapte o texto abaixo para fornecer essa informação.]</w:t>
-      </w:r>
-    </w:p>
-    <w:p>
-      <w:pPr>
-        <w:spacing w:line="360" w:lineRule="auto"/>
-        <w:ind w:left="708"/>
-        <w:jc w:val="both"/>
-        <w:rPr>
-          <w:rFonts w:ascii="Arial" w:hAnsi="Arial" w:cs="Arial"/>
           <w:highlight w:val="yellow"/>
         </w:rPr>
-      </w:pPr>
+        <w:t xml:space="preserve">Esta introdução fornece as informações necessárias para fazer um bom uso deste documento, explicitando seus objetivos e as convenções que foram adotadas no texto, além de conter uma lista de referências para outros documentos relacionados. As demais seções apresentam a especificação do </w:t>
+      </w:r>
       <w:r>
         <w:rPr>
           <w:rFonts w:ascii="Arial" w:hAnsi="Arial" w:cs="Arial"/>
           <w:highlight w:val="yellow"/>
         </w:rPr>
-        <w:t xml:space="preserve">Esta introdução fornece as informações necessárias para fazer um bom uso deste documento, explicitando seus objetivos e as convenções que foram adotadas no texto, além de conter uma lista de referências para outros documentos relacionados. As demais seções apresentam a especificação do </w:t>
+        <w:t>procedimento</w:t>
       </w:r>
       <w:r>
         <w:rPr>
           <w:rFonts w:ascii="Arial" w:hAnsi="Arial" w:cs="Arial"/>
           <w:highlight w:val="yellow"/>
         </w:rPr>
-        <w:t>procedimento</w:t>
+        <w:t xml:space="preserve"> </w:t>
       </w:r>
       <w:r>
         <w:rPr>
           <w:rFonts w:ascii="Arial" w:hAnsi="Arial" w:cs="Arial"/>
           <w:highlight w:val="yellow"/>
         </w:rPr>
-        <w:t xml:space="preserve"> </w:t>
-      </w:r>
-      <w:r>
-        <w:rPr>
-          <w:rFonts w:ascii="Arial" w:hAnsi="Arial" w:cs="Arial"/>
-          <w:i/>
-          <w:color w:val="0000FF"/>
-          <w:highlight w:val="yellow"/>
-        </w:rPr>
-        <w:t xml:space="preserve">[Nome do </w:t>
-      </w:r>
-      <w:r>
-        <w:rPr>
-          <w:rFonts w:ascii="Arial" w:hAnsi="Arial" w:cs="Arial"/>
-          <w:i/>
-          <w:color w:val="0000FF"/>
-          <w:highlight w:val="yellow"/>
-        </w:rPr>
-        <w:t>Projeto</w:t>
-      </w:r>
-      <w:r>
-        <w:rPr>
-          <w:rFonts w:ascii="Arial" w:hAnsi="Arial" w:cs="Arial"/>
-          <w:i/>
-          <w:color w:val="0000FF"/>
-          <w:highlight w:val="yellow"/>
-        </w:rPr>
-        <w:t>]</w:t>
+        <w:t>VC-VCN</w:t>
       </w:r>
       <w:r>
         <w:rPr>
@@ -7110,7 +6858,6 @@
         </w:rPr>
         <w:t xml:space="preserve">: </w:t>
       </w:r>
-      <w:proofErr w:type="spellStart"/>
       <w:r>
         <w:rPr>
           <w:rFonts w:ascii="Arial" w:hAnsi="Arial" w:cs="Arial"/>
@@ -7118,7 +6865,6 @@
         </w:rPr>
         <w:t>xxx</w:t>
       </w:r>
-      <w:proofErr w:type="spellEnd"/>
       <w:r>
         <w:rPr>
           <w:rFonts w:ascii="Arial" w:hAnsi="Arial" w:cs="Arial"/>
@@ -7168,23 +6914,7 @@
           <w:rFonts w:ascii="Arial" w:hAnsi="Arial" w:cs="Arial"/>
           <w:highlight w:val="yellow"/>
         </w:rPr>
-        <w:t xml:space="preserve">: </w:t>
-      </w:r>
-      <w:proofErr w:type="spellStart"/>
-      <w:r>
-        <w:rPr>
-          <w:rFonts w:ascii="Arial" w:hAnsi="Arial" w:cs="Arial"/>
-          <w:highlight w:val="yellow"/>
-        </w:rPr>
-        <w:t>Xxxxxxxx</w:t>
-      </w:r>
-      <w:proofErr w:type="spellEnd"/>
-      <w:r>
-        <w:rPr>
-          <w:rFonts w:ascii="Arial" w:hAnsi="Arial" w:cs="Arial"/>
-          <w:highlight w:val="yellow"/>
-        </w:rPr>
-        <w:t>.</w:t>
+        <w:t>: Xxxxxxxx.</w:t>
       </w:r>
     </w:p>
     <w:p>
@@ -7228,23 +6958,7 @@
           <w:rFonts w:ascii="Arial" w:hAnsi="Arial" w:cs="Arial"/>
           <w:highlight w:val="yellow"/>
         </w:rPr>
-        <w:t xml:space="preserve">: </w:t>
-      </w:r>
-      <w:proofErr w:type="spellStart"/>
-      <w:r>
-        <w:rPr>
-          <w:rFonts w:ascii="Arial" w:hAnsi="Arial" w:cs="Arial"/>
-          <w:highlight w:val="yellow"/>
-        </w:rPr>
-        <w:t>Xxxxxxxxxxxxxx</w:t>
-      </w:r>
-      <w:proofErr w:type="spellEnd"/>
-      <w:r>
-        <w:rPr>
-          <w:rFonts w:ascii="Arial" w:hAnsi="Arial" w:cs="Arial"/>
-          <w:highlight w:val="yellow"/>
-        </w:rPr>
-        <w:t>.</w:t>
+        <w:t>: Xxxxxxxxxxxxxx.</w:t>
       </w:r>
     </w:p>
     <w:p>
@@ -7333,58 +7047,6 @@
         <w:t>Definições, Acrônimos e Abreviações</w:t>
       </w:r>
       <w:bookmarkEnd w:id="35"/>
-    </w:p>
-    <w:p>
-      <w:pPr>
-        <w:spacing w:line="360" w:lineRule="auto"/>
-        <w:ind w:left="708"/>
-        <w:jc w:val="both"/>
-        <w:rPr>
-          <w:rFonts w:ascii="Arial" w:hAnsi="Arial" w:cs="Arial"/>
-          <w:i/>
-          <w:iCs/>
-          <w:color w:val="0000FF"/>
-        </w:rPr>
-      </w:pPr>
-      <w:r>
-        <w:rPr>
-          <w:rFonts w:ascii="Arial" w:hAnsi="Arial" w:cs="Arial"/>
-          <w:i/>
-          <w:iCs/>
-          <w:color w:val="0000FF"/>
-        </w:rPr>
-        <w:t>[</w:t>
-      </w:r>
-      <w:proofErr w:type="spellStart"/>
-      <w:r>
-        <w:rPr>
-          <w:rFonts w:ascii="Arial" w:hAnsi="Arial" w:cs="Arial"/>
-          <w:i/>
-          <w:iCs/>
-          <w:color w:val="0000FF"/>
-        </w:rPr>
-        <w:t>Esta</w:t>
-      </w:r>
-      <w:proofErr w:type="spellEnd"/>
-      <w:r>
-        <w:rPr>
-          <w:rFonts w:ascii="Arial" w:hAnsi="Arial" w:cs="Arial"/>
-          <w:i/>
-          <w:iCs/>
-          <w:color w:val="0000FF"/>
-        </w:rPr>
-        <w:t xml:space="preserve"> subseção deve descrever as convenções, termos e abreviações necessários para interpretar apropriadamente este documento. As explicações necessárias </w:t>
-      </w:r>
-      <w:r>
-        <w:rPr>
-          <w:rFonts w:ascii="Arial" w:hAnsi="Arial" w:cs="Arial"/>
-          <w:i/>
-          <w:iCs/>
-          <w:color w:val="0000FF"/>
-        </w:rPr>
-        <w:lastRenderedPageBreak/>
-        <w:t>podem ser fornecidas diretamente nesta seção ou através de referências para outros documentos ou para apêndices deste documento. Complete e/ou adapte o texto abaixo para fornecer essas informações.]</w:t>
-      </w:r>
     </w:p>
     <w:p>
       <w:pPr>
@@ -7852,7 +7514,6 @@
         <w:lastRenderedPageBreak/>
         <w:t xml:space="preserve">Cronograma (Diagrama de </w:t>
       </w:r>
-      <w:proofErr w:type="spellStart"/>
       <w:r>
         <w:rPr>
           <w:rFonts w:ascii="Arial" w:hAnsi="Arial"/>
@@ -7861,7 +7522,6 @@
         </w:rPr>
         <w:t>Gantt</w:t>
       </w:r>
-      <w:proofErr w:type="spellEnd"/>
       <w:r>
         <w:rPr>
           <w:rFonts w:ascii="Arial" w:hAnsi="Arial"/>
@@ -8190,7 +7850,6 @@
         </w:rPr>
         <w:t xml:space="preserve"> </w:t>
       </w:r>
-      <w:proofErr w:type="spellStart"/>
       <w:r>
         <w:rPr>
           <w:rFonts w:ascii="Arial" w:hAnsi="Arial"/>
@@ -8200,28 +7859,20 @@
         <w:t>Web-Site</w:t>
       </w:r>
       <w:bookmarkEnd w:id="39"/>
-      <w:proofErr w:type="spellEnd"/>
     </w:p>
     <w:p>
       <w:pPr>
         <w:spacing w:line="360" w:lineRule="auto"/>
         <w:ind w:left="425"/>
-        <w:jc w:val="both"/>
-        <w:rPr>
-          <w:rFonts w:ascii="Arial" w:hAnsi="Arial" w:cs="Arial"/>
-          <w:i/>
-          <w:iCs/>
-          <w:color w:val="0000FF"/>
-        </w:rPr>
-      </w:pPr>
-      <w:r>
-        <w:rPr>
-          <w:rFonts w:ascii="Arial" w:hAnsi="Arial" w:cs="Arial"/>
-          <w:i/>
-          <w:iCs/>
-          <w:color w:val="0000FF"/>
-        </w:rPr>
-        <w:t>[Descreva aqui, em linhas gerais, as necessidades da Empresa e do Software e sua importância.]</w:t>
+        <w:rPr>
+          <w:rFonts w:ascii="Arial" w:hAnsi="Arial" w:cs="Arial"/>
+        </w:rPr>
+      </w:pPr>
+      <w:r>
+        <w:rPr>
+          <w:rFonts w:ascii="Arial" w:hAnsi="Arial" w:cs="Arial"/>
+        </w:rPr>
+        <w:t>As clínicas veterinárias necessitam organizar diferentes informações relacionadas aos animais atendidos, aos seus responsáveis e aos produtos utilizados durante os procedimentos realizados. Entre essas necessidades estão o controle adequado do estoque de vacinas e o acompanhamento das datas previstas para vacinação dos pets.</w:t>
       </w:r>
     </w:p>
     <w:p>
@@ -8236,7 +7887,7 @@
         <w:rPr>
           <w:rFonts w:ascii="Arial" w:hAnsi="Arial" w:cs="Arial"/>
         </w:rPr>
-        <w:t>Aqui vai o Texto</w:t>
+        <w:t>A falta de um controle organizado pode ocasionar problemas como a ausência de determinada vacina no momento do atendimento, perda de produtos devido ao vencimento e dificuldade para identificar quais animais possuem vacinas previstas para os próximos dias.</w:t>
       </w:r>
     </w:p>
     <w:p>
@@ -8247,6 +7898,26 @@
           <w:rFonts w:ascii="Arial" w:hAnsi="Arial" w:cs="Arial"/>
         </w:rPr>
       </w:pPr>
+      <w:r>
+        <w:rPr>
+          <w:rFonts w:ascii="Arial" w:hAnsi="Arial" w:cs="Arial"/>
+        </w:rPr>
+        <w:t xml:space="preserve">O </w:t>
+      </w:r>
+      <w:r>
+        <w:rPr>
+          <w:rFonts w:ascii="Arial" w:hAnsi="Arial" w:cs="Arial"/>
+          <w:b/>
+          <w:bCs/>
+        </w:rPr>
+        <w:t>VetCare</w:t>
+      </w:r>
+      <w:r>
+        <w:rPr>
+          <w:rFonts w:ascii="Arial" w:hAnsi="Arial" w:cs="Arial"/>
+        </w:rPr>
+        <w:t xml:space="preserve"> busca atender a essas necessidades por meio da informatização desses controles. Nesta etapa do projeto, serão desenvolvidas funcionalidades para gerenciamento do estoque de vacinas e acompanhamento do calendário de vacinação dos pets. O sistema contará com uma aplicação para manutenção dos dados e uma interface Web para consulta das informações.</w:t>
+      </w:r>
     </w:p>
     <w:p>
       <w:pPr>
@@ -8281,19 +7952,13 @@
         <w:jc w:val="both"/>
         <w:rPr>
           <w:rFonts w:ascii="Arial" w:hAnsi="Arial" w:cs="Arial"/>
-          <w:i/>
-          <w:iCs/>
-          <w:color w:val="0000FF"/>
-        </w:rPr>
-      </w:pPr>
-      <w:r>
-        <w:rPr>
-          <w:rFonts w:ascii="Arial" w:hAnsi="Arial" w:cs="Arial"/>
-          <w:i/>
-          <w:iCs/>
-          <w:color w:val="0000FF"/>
-        </w:rPr>
-        <w:t>[Descreva a Empresa e descreva nas subseções abaixo as características específicas dos negócios da empresa.]</w:t>
+        </w:rPr>
+      </w:pPr>
+      <w:r>
+        <w:rPr>
+          <w:rFonts w:ascii="Arial" w:hAnsi="Arial" w:cs="Arial"/>
+        </w:rPr>
+        <w:t>Para o desenvolvimento do projeto será considerada uma clínica veterinária de pequeno ou médio porte que realiza atendimentos de animais domésticos e oferece, entre seus serviços, a aplicação e o acompanhamento de vacinas.</w:t>
       </w:r>
     </w:p>
     <w:p>
@@ -8309,16 +7974,8 @@
         <w:rPr>
           <w:rFonts w:ascii="Arial" w:hAnsi="Arial" w:cs="Arial"/>
         </w:rPr>
-        <w:t>Aqui vai o Texto</w:t>
-      </w:r>
-    </w:p>
-    <w:p>
-      <w:pPr>
-        <w:spacing w:line="360" w:lineRule="auto"/>
-        <w:rPr>
-          <w:rFonts w:ascii="Arial" w:hAnsi="Arial" w:cs="Arial"/>
-        </w:rPr>
-      </w:pPr>
+        <w:t>A clínica necessita manter informações sobre os animais atendidos e organizar os recursos utilizados na prestação de seus serviços. Dentro do escopo deste projeto, serão consideradas principalmente as atividades relacionadas à vacinação, envolvendo tanto o controle das vacinas disponíveis em estoque quanto o acompanhamento do calendário de vacinação dos pets.</w:t>
+      </w:r>
     </w:p>
     <w:p>
       <w:pPr>
@@ -8331,18 +7988,14 @@
           <w:szCs w:val="28"/>
         </w:rPr>
       </w:pPr>
-      <w:bookmarkStart w:id="42" w:name="_Toc146806846"/>
-      <w:bookmarkStart w:id="43" w:name="_Toc238747140"/>
       <w:r>
         <w:rPr>
           <w:rFonts w:ascii="Arial" w:hAnsi="Arial"/>
           <w:sz w:val="28"/>
           <w:szCs w:val="28"/>
         </w:rPr>
-        <w:t>Produto ou Serviço A</w:t>
-      </w:r>
-      <w:bookmarkEnd w:id="42"/>
-      <w:bookmarkEnd w:id="43"/>
+        <w:t>Vacinação de Animais</w:t>
+      </w:r>
     </w:p>
     <w:p>
       <w:pPr>
@@ -8351,19 +8004,20 @@
         <w:jc w:val="both"/>
         <w:rPr>
           <w:rFonts w:ascii="Arial" w:hAnsi="Arial" w:cs="Arial"/>
-          <w:i/>
-          <w:iCs/>
-          <w:color w:val="0000FF"/>
-        </w:rPr>
-      </w:pPr>
-      <w:r>
-        <w:rPr>
-          <w:rFonts w:ascii="Arial" w:hAnsi="Arial" w:cs="Arial"/>
-          <w:i/>
-          <w:iCs/>
-          <w:color w:val="0000FF"/>
-        </w:rPr>
-        <w:t>[Esta seção deve descrever o que é, o que faz e a importância do Produto ou Serviço A.]</w:t>
+        </w:rPr>
+      </w:pPr>
+      <w:r>
+        <w:rPr>
+          <w:rFonts w:ascii="Arial" w:hAnsi="Arial" w:cs="Arial"/>
+        </w:rPr>
+        <w:t xml:space="preserve">A vacinação é um dos serviços oferecidos pela clínica veterinária e tem como objetivo auxiliar na prevenção de doenças e na manutenção da saúde dos </w:t>
+      </w:r>
+      <w:r>
+        <w:rPr>
+          <w:rFonts w:ascii="Arial" w:hAnsi="Arial" w:cs="Arial"/>
+        </w:rPr>
+        <w:lastRenderedPageBreak/>
+        <w:t>animais. Para a realização adequada desse serviço, é necessário que a clínica mantenha disponíveis as vacinas utilizadas em seus atendimentos e acompanhe informações importantes, como quantidade em estoque e prazo de validade.</w:t>
       </w:r>
     </w:p>
     <w:p>
@@ -8379,16 +8033,8 @@
         <w:rPr>
           <w:rFonts w:ascii="Arial" w:hAnsi="Arial" w:cs="Arial"/>
         </w:rPr>
-        <w:t>Aqui vai o Texto</w:t>
-      </w:r>
-    </w:p>
-    <w:p>
-      <w:pPr>
-        <w:spacing w:line="360" w:lineRule="auto"/>
-        <w:rPr>
-          <w:rFonts w:ascii="Arial" w:hAnsi="Arial" w:cs="Arial"/>
-        </w:rPr>
-      </w:pPr>
+        <w:t>O VetCare auxiliará nesse processo permitindo o controle das vacinas disponíveis e a identificação da necessidade de reposição do estoque, além do acompanhamento das respectivas datas de validade.</w:t>
+      </w:r>
     </w:p>
     <w:p>
       <w:pPr>
@@ -8401,16 +8047,14 @@
           <w:szCs w:val="28"/>
         </w:rPr>
       </w:pPr>
-      <w:bookmarkStart w:id="44" w:name="_Toc238747141"/>
       <w:r>
         <w:rPr>
           <w:rFonts w:ascii="Arial" w:hAnsi="Arial"/>
           <w:sz w:val="28"/>
           <w:szCs w:val="28"/>
         </w:rPr>
-        <w:t>Produto ou Serviço B</w:t>
-      </w:r>
-      <w:bookmarkEnd w:id="44"/>
+        <w:t>Acompanhamento do Calendário de Vacinação</w:t>
+      </w:r>
     </w:p>
     <w:p>
       <w:pPr>
@@ -8419,19 +8063,13 @@
         <w:jc w:val="both"/>
         <w:rPr>
           <w:rFonts w:ascii="Arial" w:hAnsi="Arial" w:cs="Arial"/>
-          <w:i/>
-          <w:iCs/>
-          <w:color w:val="0000FF"/>
-        </w:rPr>
-      </w:pPr>
-      <w:r>
-        <w:rPr>
-          <w:rFonts w:ascii="Arial" w:hAnsi="Arial" w:cs="Arial"/>
-          <w:i/>
-          <w:iCs/>
-          <w:color w:val="0000FF"/>
-        </w:rPr>
-        <w:t>[Esta seção deve descrever o que é, o que faz e a importância do Produto ou Serviço B.]</w:t>
+        </w:rPr>
+      </w:pPr>
+      <w:r>
+        <w:rPr>
+          <w:rFonts w:ascii="Arial" w:hAnsi="Arial" w:cs="Arial"/>
+        </w:rPr>
+        <w:t>Além da aplicação das vacinas, a clínica realiza o acompanhamento do calendário de vacinação dos animais atendidos. Esse acompanhamento permite identificar quando cada pet deverá receber uma nova dose ou determinada vacina prevista em seu calendário.</w:t>
       </w:r>
     </w:p>
     <w:p>
@@ -8447,16 +8085,8 @@
         <w:rPr>
           <w:rFonts w:ascii="Arial" w:hAnsi="Arial" w:cs="Arial"/>
         </w:rPr>
-        <w:t>Aqui vai o Texto</w:t>
-      </w:r>
-    </w:p>
-    <w:p>
-      <w:pPr>
-        <w:spacing w:line="360" w:lineRule="auto"/>
-        <w:rPr>
-          <w:rFonts w:ascii="Arial" w:hAnsi="Arial" w:cs="Arial"/>
-        </w:rPr>
-      </w:pPr>
+        <w:t>O VetCare permitirá consultar os pets que possuem vacinação prevista para os próximos dias, considerando um período informado pelo usuário. Dessa forma, a clínica poderá organizar antecipadamente os atendimentos relacionados à vacinação.</w:t>
+      </w:r>
     </w:p>
     <w:p>
       <w:pPr>
@@ -8469,8 +8099,8 @@
           <w:szCs w:val="28"/>
         </w:rPr>
       </w:pPr>
-      <w:bookmarkStart w:id="45" w:name="_Toc146806848"/>
-      <w:bookmarkStart w:id="46" w:name="_Toc238747142"/>
+      <w:bookmarkStart w:id="42" w:name="_Toc146806848"/>
+      <w:bookmarkStart w:id="43" w:name="_Toc238747142"/>
       <w:r>
         <w:rPr>
           <w:rFonts w:ascii="Arial" w:hAnsi="Arial"/>
@@ -8479,8 +8109,8 @@
         </w:rPr>
         <w:t>Estratégias de Negócio da Empresa</w:t>
       </w:r>
-      <w:bookmarkEnd w:id="45"/>
-      <w:bookmarkEnd w:id="46"/>
+      <w:bookmarkEnd w:id="42"/>
+      <w:bookmarkEnd w:id="43"/>
     </w:p>
     <w:p>
       <w:pPr>
@@ -8489,19 +8119,13 @@
         <w:jc w:val="both"/>
         <w:rPr>
           <w:rFonts w:ascii="Arial" w:hAnsi="Arial" w:cs="Arial"/>
-          <w:i/>
-          <w:iCs/>
-          <w:color w:val="0000FF"/>
-        </w:rPr>
-      </w:pPr>
-      <w:r>
-        <w:rPr>
-          <w:rFonts w:ascii="Arial" w:hAnsi="Arial" w:cs="Arial"/>
-          <w:i/>
-          <w:iCs/>
-          <w:color w:val="0000FF"/>
-        </w:rPr>
-        <w:t>[Esta seção deve descrever o que é, o que faz e a importância das estratégias de negócio da Empresa]</w:t>
+        </w:rPr>
+      </w:pPr>
+      <w:r>
+        <w:rPr>
+          <w:rFonts w:ascii="Arial" w:hAnsi="Arial" w:cs="Arial"/>
+        </w:rPr>
+        <w:t>A estratégia da clínica está baseada na organização das informações e no acompanhamento preventivo dos animais atendidos. O controle adequado do estoque busca garantir a disponibilidade das vacinas necessárias, evitando tanto a falta de produtos quanto perdas decorrentes do vencimento.</w:t>
       </w:r>
     </w:p>
     <w:p>
@@ -8517,16 +8141,24 @@
         <w:rPr>
           <w:rFonts w:ascii="Arial" w:hAnsi="Arial" w:cs="Arial"/>
         </w:rPr>
-        <w:t>Aqui vai o Texto</w:t>
-      </w:r>
-    </w:p>
-    <w:p>
-      <w:pPr>
-        <w:spacing w:line="360" w:lineRule="auto"/>
-        <w:rPr>
-          <w:rFonts w:ascii="Arial" w:hAnsi="Arial" w:cs="Arial"/>
-        </w:rPr>
-      </w:pPr>
+        <w:t>O acompanhamento do calendário de vacinação permite à clínica identificar antecipadamente os animais que possuem vacinas previstas, contribuindo para o planejamento dos atendimentos e para a continuidade do relacionamento com seus clientes.</w:t>
+      </w:r>
+    </w:p>
+    <w:p>
+      <w:pPr>
+        <w:spacing w:line="360" w:lineRule="auto"/>
+        <w:ind w:left="1416"/>
+        <w:jc w:val="both"/>
+        <w:rPr>
+          <w:rFonts w:ascii="Arial" w:hAnsi="Arial" w:cs="Arial"/>
+        </w:rPr>
+      </w:pPr>
+      <w:r>
+        <w:rPr>
+          <w:rFonts w:ascii="Arial" w:hAnsi="Arial" w:cs="Arial"/>
+        </w:rPr>
+        <w:t>Nesse contexto, o VetCare atua como ferramenta de apoio à gestão, centralizando informações importantes e tornando mais simples a consulta dos dados necessários para a execução dessas atividades.</w:t>
+      </w:r>
     </w:p>
     <w:p>
       <w:pPr>
@@ -8552,7 +8184,7 @@
           <w:rFonts w:ascii="Arial" w:hAnsi="Arial"/>
         </w:rPr>
       </w:pPr>
-      <w:bookmarkStart w:id="47" w:name="_Toc238747143"/>
+      <w:bookmarkStart w:id="44" w:name="_Toc238747143"/>
       <w:r>
         <w:rPr>
           <w:rFonts w:ascii="Arial" w:hAnsi="Arial"/>
@@ -8560,7 +8192,7 @@
         <w:lastRenderedPageBreak/>
         <w:t>Definição da Estrutura das Páginas</w:t>
       </w:r>
-      <w:bookmarkEnd w:id="47"/>
+      <w:bookmarkEnd w:id="44"/>
     </w:p>
     <w:p>
       <w:pPr>
@@ -8574,8 +8206,8 @@
           <w:color w:val="0000FF"/>
         </w:rPr>
       </w:pPr>
-      <w:bookmarkStart w:id="48" w:name="_Toc5214878"/>
-      <w:bookmarkStart w:id="49" w:name="_Toc5214883"/>
+      <w:bookmarkStart w:id="45" w:name="_Toc5214878"/>
+      <w:bookmarkStart w:id="46" w:name="_Toc5214883"/>
       <w:r>
         <w:rPr>
           <w:rFonts w:ascii="Arial" w:hAnsi="Arial" w:cs="Arial"/>
@@ -8592,19 +8224,8 @@
           <w:iCs/>
           <w:color w:val="0000FF"/>
         </w:rPr>
-        <w:t xml:space="preserve">Descreva aqui, em linhas gerais, a Estrutura das Páginas do Software, as abordagens, os </w:t>
-      </w:r>
-      <w:proofErr w:type="gramStart"/>
-      <w:r>
-        <w:rPr>
-          <w:rFonts w:ascii="Arial" w:hAnsi="Arial" w:cs="Arial"/>
-          <w:i/>
-          <w:iCs/>
-          <w:color w:val="0000FF"/>
-        </w:rPr>
-        <w:t>atrativos, etc.</w:t>
-      </w:r>
-      <w:proofErr w:type="gramEnd"/>
+        <w:t>Descreva aqui, em linhas gerais, a Estrutura das Páginas do Software, as abordagens, os atrativos, etc.</w:t>
+      </w:r>
       <w:r>
         <w:rPr>
           <w:rFonts w:ascii="Arial" w:hAnsi="Arial" w:cs="Arial"/>
@@ -8653,8 +8274,8 @@
           <w:b/>
         </w:rPr>
       </w:pPr>
-      <w:bookmarkStart w:id="50" w:name="_Toc146806850"/>
-      <w:bookmarkStart w:id="51" w:name="_Toc238747144"/>
+      <w:bookmarkStart w:id="47" w:name="_Toc146806850"/>
+      <w:bookmarkStart w:id="48" w:name="_Toc238747144"/>
       <w:r>
         <w:rPr>
           <w:rFonts w:ascii="Arial" w:hAnsi="Arial"/>
@@ -8662,8 +8283,8 @@
         </w:rPr>
         <w:t>Analista A</w:t>
       </w:r>
-      <w:bookmarkEnd w:id="50"/>
-      <w:bookmarkEnd w:id="51"/>
+      <w:bookmarkEnd w:id="47"/>
+      <w:bookmarkEnd w:id="48"/>
     </w:p>
     <w:p>
       <w:pPr>
@@ -8746,8 +8367,8 @@
         </w:rPr>
         <w:t xml:space="preserve"> </w:t>
       </w:r>
-      <w:bookmarkStart w:id="52" w:name="_Toc146806851"/>
-      <w:bookmarkStart w:id="53" w:name="_Toc238747145"/>
+      <w:bookmarkStart w:id="49" w:name="_Toc146806851"/>
+      <w:bookmarkStart w:id="50" w:name="_Toc238747145"/>
       <w:r>
         <w:rPr>
           <w:rFonts w:ascii="Arial" w:hAnsi="Arial"/>
@@ -8764,8 +8385,8 @@
         </w:rPr>
         <w:t xml:space="preserve"> A</w:t>
       </w:r>
-      <w:bookmarkEnd w:id="52"/>
-      <w:bookmarkEnd w:id="53"/>
+      <w:bookmarkEnd w:id="49"/>
+      <w:bookmarkEnd w:id="50"/>
     </w:p>
     <w:p>
       <w:pPr>
@@ -8844,8 +8465,8 @@
           <w:b/>
         </w:rPr>
       </w:pPr>
-      <w:bookmarkStart w:id="54" w:name="_Toc146806853"/>
-      <w:bookmarkStart w:id="55" w:name="_Toc238747146"/>
+      <w:bookmarkStart w:id="51" w:name="_Toc146806853"/>
+      <w:bookmarkStart w:id="52" w:name="_Toc238747146"/>
       <w:r>
         <w:rPr>
           <w:rFonts w:ascii="Arial" w:hAnsi="Arial"/>
@@ -8853,8 +8474,8 @@
         </w:rPr>
         <w:t>Analista B</w:t>
       </w:r>
-      <w:bookmarkEnd w:id="54"/>
-      <w:bookmarkEnd w:id="55"/>
+      <w:bookmarkEnd w:id="51"/>
+      <w:bookmarkEnd w:id="52"/>
     </w:p>
     <w:p>
       <w:pPr>
@@ -8937,8 +8558,8 @@
         </w:rPr>
         <w:t xml:space="preserve"> </w:t>
       </w:r>
-      <w:bookmarkStart w:id="56" w:name="_Toc146806854"/>
-      <w:bookmarkStart w:id="57" w:name="_Toc238747147"/>
+      <w:bookmarkStart w:id="53" w:name="_Toc146806854"/>
+      <w:bookmarkStart w:id="54" w:name="_Toc238747147"/>
       <w:r>
         <w:rPr>
           <w:rFonts w:ascii="Arial" w:hAnsi="Arial"/>
@@ -8955,7 +8576,7 @@
         </w:rPr>
         <w:t xml:space="preserve"> </w:t>
       </w:r>
-      <w:bookmarkEnd w:id="56"/>
+      <w:bookmarkEnd w:id="53"/>
       <w:r>
         <w:rPr>
           <w:rFonts w:ascii="Arial" w:hAnsi="Arial"/>
@@ -8964,7 +8585,7 @@
         </w:rPr>
         <w:t>B</w:t>
       </w:r>
-      <w:bookmarkEnd w:id="57"/>
+      <w:bookmarkEnd w:id="54"/>
     </w:p>
     <w:p>
       <w:pPr>
@@ -9043,8 +8664,8 @@
           <w:b/>
         </w:rPr>
       </w:pPr>
-      <w:bookmarkStart w:id="58" w:name="_Toc146806856"/>
-      <w:bookmarkStart w:id="59" w:name="_Toc238747148"/>
+      <w:bookmarkStart w:id="55" w:name="_Toc146806856"/>
+      <w:bookmarkStart w:id="56" w:name="_Toc238747148"/>
       <w:r>
         <w:rPr>
           <w:rFonts w:ascii="Arial" w:hAnsi="Arial"/>
@@ -9052,8 +8673,8 @@
         </w:rPr>
         <w:t>Analista C</w:t>
       </w:r>
-      <w:bookmarkEnd w:id="58"/>
-      <w:bookmarkEnd w:id="59"/>
+      <w:bookmarkEnd w:id="55"/>
+      <w:bookmarkEnd w:id="56"/>
     </w:p>
     <w:p>
       <w:pPr>
@@ -9137,7 +8758,7 @@
         <w:lastRenderedPageBreak/>
         <w:t xml:space="preserve"> </w:t>
       </w:r>
-      <w:bookmarkStart w:id="60" w:name="_Toc238747149"/>
+      <w:bookmarkStart w:id="57" w:name="_Toc238747149"/>
       <w:r>
         <w:rPr>
           <w:rFonts w:ascii="Arial" w:hAnsi="Arial"/>
@@ -9146,7 +8767,7 @@
         </w:rPr>
         <w:t>Página C</w:t>
       </w:r>
-      <w:bookmarkEnd w:id="60"/>
+      <w:bookmarkEnd w:id="57"/>
     </w:p>
     <w:p>
       <w:pPr>
@@ -9233,8 +8854,8 @@
           <w:b/>
         </w:rPr>
       </w:pPr>
-      <w:bookmarkStart w:id="61" w:name="_Toc146806859"/>
-      <w:bookmarkStart w:id="62" w:name="_Toc238747150"/>
+      <w:bookmarkStart w:id="58" w:name="_Toc146806859"/>
+      <w:bookmarkStart w:id="59" w:name="_Toc238747150"/>
       <w:r>
         <w:rPr>
           <w:rFonts w:ascii="Arial" w:hAnsi="Arial"/>
@@ -9242,8 +8863,8 @@
         </w:rPr>
         <w:t>Analista D</w:t>
       </w:r>
-      <w:bookmarkEnd w:id="61"/>
-      <w:bookmarkEnd w:id="62"/>
+      <w:bookmarkEnd w:id="58"/>
+      <w:bookmarkEnd w:id="59"/>
     </w:p>
     <w:p>
       <w:pPr>
@@ -9326,7 +8947,7 @@
         </w:rPr>
         <w:t xml:space="preserve"> </w:t>
       </w:r>
-      <w:bookmarkStart w:id="63" w:name="_Toc238747151"/>
+      <w:bookmarkStart w:id="60" w:name="_Toc238747151"/>
       <w:r>
         <w:rPr>
           <w:rFonts w:ascii="Arial" w:hAnsi="Arial"/>
@@ -9335,7 +8956,7 @@
         </w:rPr>
         <w:t>Página D</w:t>
       </w:r>
-      <w:bookmarkEnd w:id="63"/>
+      <w:bookmarkEnd w:id="60"/>
     </w:p>
     <w:p>
       <w:pPr>
@@ -9414,8 +9035,8 @@
           <w:b/>
         </w:rPr>
       </w:pPr>
-      <w:bookmarkStart w:id="64" w:name="_Toc146806862"/>
-      <w:bookmarkStart w:id="65" w:name="_Toc238747152"/>
+      <w:bookmarkStart w:id="61" w:name="_Toc146806862"/>
+      <w:bookmarkStart w:id="62" w:name="_Toc238747152"/>
       <w:r>
         <w:rPr>
           <w:rFonts w:ascii="Arial" w:hAnsi="Arial"/>
@@ -9423,8 +9044,8 @@
         </w:rPr>
         <w:t>Analista E</w:t>
       </w:r>
-      <w:bookmarkEnd w:id="64"/>
-      <w:bookmarkEnd w:id="65"/>
+      <w:bookmarkEnd w:id="61"/>
+      <w:bookmarkEnd w:id="62"/>
     </w:p>
     <w:p>
       <w:pPr>
@@ -9507,7 +9128,7 @@
         </w:rPr>
         <w:t xml:space="preserve"> </w:t>
       </w:r>
-      <w:bookmarkStart w:id="66" w:name="_Toc238747153"/>
+      <w:bookmarkStart w:id="63" w:name="_Toc238747153"/>
       <w:r>
         <w:rPr>
           <w:rFonts w:ascii="Arial" w:hAnsi="Arial"/>
@@ -9516,7 +9137,7 @@
         </w:rPr>
         <w:t>Página E</w:t>
       </w:r>
-      <w:bookmarkEnd w:id="66"/>
+      <w:bookmarkEnd w:id="63"/>
     </w:p>
     <w:p>
       <w:pPr>
@@ -9603,8 +9224,8 @@
           <w:b/>
         </w:rPr>
       </w:pPr>
-      <w:bookmarkStart w:id="67" w:name="_Toc146806865"/>
-      <w:bookmarkStart w:id="68" w:name="_Toc238747154"/>
+      <w:bookmarkStart w:id="64" w:name="_Toc146806865"/>
+      <w:bookmarkStart w:id="65" w:name="_Toc238747154"/>
       <w:r>
         <w:rPr>
           <w:rFonts w:ascii="Arial" w:hAnsi="Arial"/>
@@ -9612,8 +9233,8 @@
         </w:rPr>
         <w:t>Analista F</w:t>
       </w:r>
-      <w:bookmarkEnd w:id="67"/>
-      <w:bookmarkEnd w:id="68"/>
+      <w:bookmarkEnd w:id="64"/>
+      <w:bookmarkEnd w:id="65"/>
     </w:p>
     <w:p>
       <w:pPr>
@@ -9697,7 +9318,7 @@
         <w:lastRenderedPageBreak/>
         <w:t xml:space="preserve"> </w:t>
       </w:r>
-      <w:bookmarkStart w:id="69" w:name="_Toc238747155"/>
+      <w:bookmarkStart w:id="66" w:name="_Toc238747155"/>
       <w:r>
         <w:rPr>
           <w:rFonts w:ascii="Arial" w:hAnsi="Arial"/>
@@ -9706,7 +9327,7 @@
         </w:rPr>
         <w:t>Página F</w:t>
       </w:r>
-      <w:bookmarkEnd w:id="69"/>
+      <w:bookmarkEnd w:id="66"/>
     </w:p>
     <w:p>
       <w:pPr>
@@ -9821,8 +9442,8 @@
           <w:rFonts w:ascii="Arial" w:hAnsi="Arial"/>
         </w:rPr>
       </w:pPr>
-      <w:bookmarkStart w:id="70" w:name="_Toc238747156"/>
-      <w:bookmarkEnd w:id="48"/>
+      <w:bookmarkStart w:id="67" w:name="_Toc238747156"/>
+      <w:bookmarkEnd w:id="45"/>
       <w:r>
         <w:rPr>
           <w:rFonts w:ascii="Arial" w:hAnsi="Arial"/>
@@ -9842,7 +9463,7 @@
         </w:rPr>
         <w:t>lgação</w:t>
       </w:r>
-      <w:bookmarkEnd w:id="70"/>
+      <w:bookmarkEnd w:id="67"/>
     </w:p>
     <w:p>
       <w:pPr>
@@ -9955,8 +9576,8 @@
           <w:rFonts w:ascii="Arial" w:hAnsi="Arial"/>
         </w:rPr>
       </w:pPr>
-      <w:bookmarkStart w:id="71" w:name="_Toc238747157"/>
-      <w:bookmarkEnd w:id="49"/>
+      <w:bookmarkStart w:id="68" w:name="_Toc238747157"/>
+      <w:bookmarkEnd w:id="46"/>
       <w:r>
         <w:rPr>
           <w:rFonts w:ascii="Arial" w:hAnsi="Arial"/>
@@ -9964,7 +9585,7 @@
         <w:lastRenderedPageBreak/>
         <w:t>Eventos, Ferramentas, Padrões e Normas</w:t>
       </w:r>
-      <w:bookmarkEnd w:id="71"/>
+      <w:bookmarkEnd w:id="68"/>
     </w:p>
     <w:p>
       <w:pPr>
@@ -10025,7 +9646,7 @@
           <w:b/>
         </w:rPr>
       </w:pPr>
-      <w:bookmarkStart w:id="72" w:name="_Toc238747158"/>
+      <w:bookmarkStart w:id="69" w:name="_Toc238747158"/>
       <w:r>
         <w:rPr>
           <w:rFonts w:ascii="Arial" w:hAnsi="Arial"/>
@@ -10033,7 +9654,7 @@
         </w:rPr>
         <w:t>Ferramentas</w:t>
       </w:r>
-      <w:bookmarkEnd w:id="72"/>
+      <w:bookmarkEnd w:id="69"/>
     </w:p>
     <w:p>
       <w:pPr>
@@ -10092,7 +9713,7 @@
           <w:rFonts w:cs="Arial"/>
         </w:rPr>
       </w:pPr>
-      <w:bookmarkStart w:id="73" w:name="_Toc238747159"/>
+      <w:bookmarkStart w:id="70" w:name="_Toc238747159"/>
       <w:r>
         <w:rPr>
           <w:rFonts w:cs="Arial"/>
@@ -10131,7 +9752,7 @@
         </w:rPr>
         <w:t>&gt;</w:t>
       </w:r>
-      <w:bookmarkEnd w:id="73"/>
+      <w:bookmarkEnd w:id="70"/>
     </w:p>
     <w:p>
       <w:pPr>
@@ -10214,7 +9835,7 @@
           <w:b/>
         </w:rPr>
       </w:pPr>
-      <w:bookmarkStart w:id="74" w:name="_Toc238747160"/>
+      <w:bookmarkStart w:id="71" w:name="_Toc238747160"/>
       <w:r>
         <w:rPr>
           <w:rFonts w:ascii="Arial" w:hAnsi="Arial"/>
@@ -10222,7 +9843,7 @@
         </w:rPr>
         <w:t>Normas</w:t>
       </w:r>
-      <w:bookmarkEnd w:id="74"/>
+      <w:bookmarkEnd w:id="71"/>
     </w:p>
     <w:p>
       <w:pPr>
@@ -10275,7 +9896,7 @@
           <w:rFonts w:cs="Arial"/>
         </w:rPr>
       </w:pPr>
-      <w:bookmarkStart w:id="75" w:name="_Toc238747161"/>
+      <w:bookmarkStart w:id="72" w:name="_Toc238747161"/>
       <w:r>
         <w:rPr>
           <w:rFonts w:cs="Arial"/>
@@ -10307,7 +9928,7 @@
         </w:rPr>
         <w:t>&gt;</w:t>
       </w:r>
-      <w:bookmarkEnd w:id="75"/>
+      <w:bookmarkEnd w:id="72"/>
     </w:p>
     <w:p>
       <w:pPr>
@@ -10401,7 +10022,7 @@
           <w:b/>
         </w:rPr>
       </w:pPr>
-      <w:bookmarkStart w:id="76" w:name="_Toc238747162"/>
+      <w:bookmarkStart w:id="73" w:name="_Toc238747162"/>
       <w:r>
         <w:rPr>
           <w:rFonts w:ascii="Arial" w:hAnsi="Arial"/>
@@ -10409,7 +10030,7 @@
         </w:rPr>
         <w:t>Padrões</w:t>
       </w:r>
-      <w:bookmarkEnd w:id="76"/>
+      <w:bookmarkEnd w:id="73"/>
     </w:p>
     <w:p>
       <w:pPr>
@@ -10462,7 +10083,7 @@
           <w:rFonts w:cs="Arial"/>
         </w:rPr>
       </w:pPr>
-      <w:bookmarkStart w:id="77" w:name="_Toc238747163"/>
+      <w:bookmarkStart w:id="74" w:name="_Toc238747163"/>
       <w:r>
         <w:rPr>
           <w:rFonts w:cs="Arial"/>
@@ -10494,7 +10115,7 @@
         </w:rPr>
         <w:t>&gt;</w:t>
       </w:r>
-      <w:bookmarkEnd w:id="77"/>
+      <w:bookmarkEnd w:id="74"/>
     </w:p>
     <w:p>
       <w:pPr>
@@ -10577,7 +10198,7 @@
           <w:b/>
         </w:rPr>
       </w:pPr>
-      <w:bookmarkStart w:id="78" w:name="_Toc238747164"/>
+      <w:bookmarkStart w:id="75" w:name="_Toc238747164"/>
       <w:r>
         <w:rPr>
           <w:rFonts w:ascii="Arial" w:hAnsi="Arial"/>
@@ -10585,7 +10206,7 @@
         </w:rPr>
         <w:t>Eventos</w:t>
       </w:r>
-      <w:bookmarkEnd w:id="78"/>
+      <w:bookmarkEnd w:id="75"/>
     </w:p>
     <w:p>
       <w:pPr>
@@ -10638,7 +10259,7 @@
           <w:rFonts w:cs="Arial"/>
         </w:rPr>
       </w:pPr>
-      <w:bookmarkStart w:id="79" w:name="_Toc238747165"/>
+      <w:bookmarkStart w:id="76" w:name="_Toc238747165"/>
       <w:r>
         <w:rPr>
           <w:rFonts w:cs="Arial"/>
@@ -10670,8 +10291,8 @@
         </w:rPr>
         <w:t>&gt;</w:t>
       </w:r>
-      <w:bookmarkStart w:id="80" w:name="_Toc142732494"/>
-      <w:bookmarkEnd w:id="79"/>
+      <w:bookmarkStart w:id="77" w:name="_Toc142732494"/>
+      <w:bookmarkEnd w:id="76"/>
     </w:p>
     <w:p>
       <w:pPr>
@@ -10781,8 +10402,8 @@
           <w:rFonts w:ascii="Arial" w:hAnsi="Arial"/>
         </w:rPr>
       </w:pPr>
-      <w:bookmarkStart w:id="81" w:name="_Toc238747166"/>
-      <w:bookmarkEnd w:id="80"/>
+      <w:bookmarkStart w:id="78" w:name="_Toc238747166"/>
+      <w:bookmarkEnd w:id="77"/>
       <w:r>
         <w:rPr>
           <w:rFonts w:ascii="Arial" w:hAnsi="Arial"/>
@@ -10790,7 +10411,7 @@
         <w:lastRenderedPageBreak/>
         <w:t>Referências</w:t>
       </w:r>
-      <w:bookmarkEnd w:id="81"/>
+      <w:bookmarkEnd w:id="78"/>
     </w:p>
     <w:p>
       <w:pPr>
@@ -10921,9 +10542,125 @@
           <w:sz w:val="24"/>
           <w:highlight w:val="yellow"/>
         </w:rPr>
-        <w:t>CD-</w:t>
-      </w:r>
-      <w:proofErr w:type="gramStart"/>
+        <w:t xml:space="preserve">CD-ROM , </w:t>
+      </w:r>
+      <w:r>
+        <w:rPr>
+          <w:rFonts w:ascii="Arial" w:hAnsi="Arial" w:cs="Arial"/>
+          <w:sz w:val="24"/>
+          <w:highlight w:val="yellow"/>
+        </w:rPr>
+        <w:t>São Paulo: Editora UNISA, 2003, p.39.</w:t>
+      </w:r>
+    </w:p>
+    <w:p>
+      <w:pPr>
+        <w:pStyle w:val="Corpodetexto"/>
+        <w:spacing w:after="0" w:line="360" w:lineRule="auto"/>
+        <w:rPr>
+          <w:rFonts w:ascii="Arial" w:hAnsi="Arial" w:cs="Arial"/>
+          <w:sz w:val="24"/>
+          <w:highlight w:val="yellow"/>
+        </w:rPr>
+      </w:pPr>
+    </w:p>
+    <w:p>
+      <w:pPr>
+        <w:pStyle w:val="Corpodetexto"/>
+        <w:spacing w:after="0" w:line="360" w:lineRule="auto"/>
+        <w:rPr>
+          <w:rFonts w:ascii="Arial" w:hAnsi="Arial" w:cs="Arial"/>
+          <w:sz w:val="24"/>
+          <w:highlight w:val="yellow"/>
+        </w:rPr>
+      </w:pPr>
+      <w:r>
+        <w:rPr>
+          <w:rFonts w:ascii="Arial" w:hAnsi="Arial" w:cs="Arial"/>
+          <w:sz w:val="24"/>
+          <w:highlight w:val="yellow"/>
+        </w:rPr>
+        <w:t>Livro com três autores</w:t>
+      </w:r>
+    </w:p>
+    <w:p>
+      <w:pPr>
+        <w:pStyle w:val="Corpodetexto"/>
+        <w:spacing w:after="0" w:line="360" w:lineRule="auto"/>
+        <w:rPr>
+          <w:rFonts w:ascii="Arial" w:hAnsi="Arial" w:cs="Arial"/>
+          <w:sz w:val="24"/>
+          <w:highlight w:val="yellow"/>
+        </w:rPr>
+      </w:pPr>
+    </w:p>
+    <w:p>
+      <w:pPr>
+        <w:pStyle w:val="Corpodetexto"/>
+        <w:spacing w:after="0" w:line="360" w:lineRule="auto"/>
+        <w:rPr>
+          <w:rFonts w:ascii="Arial" w:hAnsi="Arial" w:cs="Arial"/>
+          <w:sz w:val="24"/>
+          <w:highlight w:val="yellow"/>
+        </w:rPr>
+      </w:pPr>
+      <w:r>
+        <w:rPr>
+          <w:rFonts w:ascii="Arial" w:hAnsi="Arial" w:cs="Arial"/>
+          <w:sz w:val="24"/>
+          <w:highlight w:val="yellow"/>
+        </w:rPr>
+        <w:t>Livro com mais de três autores</w:t>
+      </w:r>
+    </w:p>
+    <w:p>
+      <w:pPr>
+        <w:pStyle w:val="Corpodetexto"/>
+        <w:spacing w:after="0" w:line="360" w:lineRule="auto"/>
+        <w:rPr>
+          <w:rFonts w:ascii="Arial" w:hAnsi="Arial" w:cs="Arial"/>
+          <w:sz w:val="24"/>
+          <w:highlight w:val="yellow"/>
+        </w:rPr>
+      </w:pPr>
+      <w:r>
+        <w:rPr>
+          <w:rFonts w:ascii="Arial" w:hAnsi="Arial" w:cs="Arial"/>
+          <w:sz w:val="24"/>
+          <w:highlight w:val="yellow"/>
+        </w:rPr>
+        <w:t>Livro com autoria desconhecida</w:t>
+      </w:r>
+    </w:p>
+    <w:p>
+      <w:pPr>
+        <w:pStyle w:val="Corpodetexto"/>
+        <w:spacing w:after="0" w:line="360" w:lineRule="auto"/>
+        <w:rPr>
+          <w:rFonts w:ascii="Arial" w:hAnsi="Arial" w:cs="Arial"/>
+          <w:sz w:val="24"/>
+          <w:highlight w:val="yellow"/>
+        </w:rPr>
+      </w:pPr>
+    </w:p>
+    <w:p>
+      <w:pPr>
+        <w:pStyle w:val="Corpodetexto"/>
+        <w:spacing w:after="0" w:line="360" w:lineRule="auto"/>
+        <w:rPr>
+          <w:rFonts w:ascii="Arial" w:hAnsi="Arial" w:cs="Arial"/>
+          <w:sz w:val="24"/>
+          <w:highlight w:val="yellow"/>
+        </w:rPr>
+      </w:pPr>
+      <w:r>
+        <w:rPr>
+          <w:rFonts w:ascii="Arial" w:hAnsi="Arial" w:cs="Arial"/>
+          <w:sz w:val="24"/>
+          <w:highlight w:val="yellow"/>
+        </w:rPr>
+        <w:t xml:space="preserve">BRASIL. </w:t>
+      </w:r>
       <w:r>
         <w:rPr>
           <w:rFonts w:ascii="Arial" w:hAnsi="Arial" w:cs="Arial"/>
@@ -10932,171 +10669,15 @@
           <w:sz w:val="24"/>
           <w:highlight w:val="yellow"/>
         </w:rPr>
-        <w:t>ROM ,</w:t>
-      </w:r>
-      <w:proofErr w:type="gramEnd"/>
-      <w:r>
-        <w:rPr>
-          <w:rFonts w:ascii="Arial" w:hAnsi="Arial" w:cs="Arial"/>
-          <w:b/>
-          <w:bCs/>
+        <w:t>Código civil</w:t>
+      </w:r>
+      <w:r>
+        <w:rPr>
+          <w:rFonts w:ascii="Arial" w:hAnsi="Arial" w:cs="Arial"/>
           <w:sz w:val="24"/>
           <w:highlight w:val="yellow"/>
         </w:rPr>
-        <w:t xml:space="preserve"> </w:t>
-      </w:r>
-      <w:r>
-        <w:rPr>
-          <w:rFonts w:ascii="Arial" w:hAnsi="Arial" w:cs="Arial"/>
-          <w:sz w:val="24"/>
-          <w:highlight w:val="yellow"/>
-        </w:rPr>
-        <w:t>São Paulo: Editora UNISA, 2003, p.39.</w:t>
-      </w:r>
-    </w:p>
-    <w:p>
-      <w:pPr>
-        <w:pStyle w:val="Corpodetexto"/>
-        <w:spacing w:after="0" w:line="360" w:lineRule="auto"/>
-        <w:rPr>
-          <w:rFonts w:ascii="Arial" w:hAnsi="Arial" w:cs="Arial"/>
-          <w:sz w:val="24"/>
-          <w:highlight w:val="yellow"/>
-        </w:rPr>
-      </w:pPr>
-    </w:p>
-    <w:p>
-      <w:pPr>
-        <w:pStyle w:val="Corpodetexto"/>
-        <w:spacing w:after="0" w:line="360" w:lineRule="auto"/>
-        <w:rPr>
-          <w:rFonts w:ascii="Arial" w:hAnsi="Arial" w:cs="Arial"/>
-          <w:sz w:val="24"/>
-          <w:highlight w:val="yellow"/>
-        </w:rPr>
-      </w:pPr>
-      <w:r>
-        <w:rPr>
-          <w:rFonts w:ascii="Arial" w:hAnsi="Arial" w:cs="Arial"/>
-          <w:sz w:val="24"/>
-          <w:highlight w:val="yellow"/>
-        </w:rPr>
-        <w:t>Livro com três autores</w:t>
-      </w:r>
-    </w:p>
-    <w:p>
-      <w:pPr>
-        <w:pStyle w:val="Corpodetexto"/>
-        <w:spacing w:after="0" w:line="360" w:lineRule="auto"/>
-        <w:rPr>
-          <w:rFonts w:ascii="Arial" w:hAnsi="Arial" w:cs="Arial"/>
-          <w:sz w:val="24"/>
-          <w:highlight w:val="yellow"/>
-        </w:rPr>
-      </w:pPr>
-    </w:p>
-    <w:p>
-      <w:pPr>
-        <w:pStyle w:val="Corpodetexto"/>
-        <w:spacing w:after="0" w:line="360" w:lineRule="auto"/>
-        <w:rPr>
-          <w:rFonts w:ascii="Arial" w:hAnsi="Arial" w:cs="Arial"/>
-          <w:sz w:val="24"/>
-          <w:highlight w:val="yellow"/>
-        </w:rPr>
-      </w:pPr>
-      <w:r>
-        <w:rPr>
-          <w:rFonts w:ascii="Arial" w:hAnsi="Arial" w:cs="Arial"/>
-          <w:sz w:val="24"/>
-          <w:highlight w:val="yellow"/>
-        </w:rPr>
-        <w:t>Livro com mais de três autores</w:t>
-      </w:r>
-    </w:p>
-    <w:p>
-      <w:pPr>
-        <w:pStyle w:val="Corpodetexto"/>
-        <w:spacing w:after="0" w:line="360" w:lineRule="auto"/>
-        <w:rPr>
-          <w:rFonts w:ascii="Arial" w:hAnsi="Arial" w:cs="Arial"/>
-          <w:sz w:val="24"/>
-          <w:highlight w:val="yellow"/>
-        </w:rPr>
-      </w:pPr>
-      <w:r>
-        <w:rPr>
-          <w:rFonts w:ascii="Arial" w:hAnsi="Arial" w:cs="Arial"/>
-          <w:sz w:val="24"/>
-          <w:highlight w:val="yellow"/>
-        </w:rPr>
-        <w:t>Livro com autoria desconhecida</w:t>
-      </w:r>
-    </w:p>
-    <w:p>
-      <w:pPr>
-        <w:pStyle w:val="Corpodetexto"/>
-        <w:spacing w:after="0" w:line="360" w:lineRule="auto"/>
-        <w:rPr>
-          <w:rFonts w:ascii="Arial" w:hAnsi="Arial" w:cs="Arial"/>
-          <w:sz w:val="24"/>
-          <w:highlight w:val="yellow"/>
-        </w:rPr>
-      </w:pPr>
-    </w:p>
-    <w:p>
-      <w:pPr>
-        <w:pStyle w:val="Corpodetexto"/>
-        <w:spacing w:after="0" w:line="360" w:lineRule="auto"/>
-        <w:rPr>
-          <w:rFonts w:ascii="Arial" w:hAnsi="Arial" w:cs="Arial"/>
-          <w:sz w:val="24"/>
-          <w:highlight w:val="yellow"/>
-        </w:rPr>
-      </w:pPr>
-      <w:r>
-        <w:rPr>
-          <w:rFonts w:ascii="Arial" w:hAnsi="Arial" w:cs="Arial"/>
-          <w:sz w:val="24"/>
-          <w:highlight w:val="yellow"/>
-        </w:rPr>
-        <w:t xml:space="preserve">BRASIL. </w:t>
-      </w:r>
-      <w:r>
-        <w:rPr>
-          <w:rFonts w:ascii="Arial" w:hAnsi="Arial" w:cs="Arial"/>
-          <w:b/>
-          <w:bCs/>
-          <w:sz w:val="24"/>
-          <w:highlight w:val="yellow"/>
-        </w:rPr>
-        <w:t>Código civil</w:t>
-      </w:r>
-      <w:r>
-        <w:rPr>
-          <w:rFonts w:ascii="Arial" w:hAnsi="Arial" w:cs="Arial"/>
-          <w:sz w:val="24"/>
-          <w:highlight w:val="yellow"/>
-        </w:rPr>
-        <w:t xml:space="preserve">. 46. ed. São </w:t>
-      </w:r>
-      <w:proofErr w:type="spellStart"/>
-      <w:r>
-        <w:rPr>
-          <w:rFonts w:ascii="Arial" w:hAnsi="Arial" w:cs="Arial"/>
-          <w:sz w:val="24"/>
-          <w:highlight w:val="yellow"/>
-        </w:rPr>
-        <w:t>Paulo:Saraiva</w:t>
-      </w:r>
-      <w:proofErr w:type="spellEnd"/>
-      <w:r>
-        <w:rPr>
-          <w:rFonts w:ascii="Arial" w:hAnsi="Arial" w:cs="Arial"/>
-          <w:sz w:val="24"/>
-          <w:highlight w:val="yellow"/>
-        </w:rPr>
-        <w:t>, 1995.</w:t>
+        <w:t>. 46. ed. São Paulo:Saraiva, 1995.</w:t>
       </w:r>
     </w:p>
     <w:p>
@@ -11189,7 +10770,6 @@
         </w:rPr>
         <w:t xml:space="preserve">. 2 ed. São Paulo. Disponível em </w:t>
       </w:r>
-      <w:proofErr w:type="gramStart"/>
       <w:r>
         <w:rPr>
           <w:rFonts w:ascii="Arial" w:hAnsi="Arial" w:cs="Arial"/>
@@ -11205,16 +10785,7 @@
           <w:sz w:val="24"/>
           <w:highlight w:val="yellow"/>
         </w:rPr>
-        <w:t>.</w:t>
-      </w:r>
-      <w:proofErr w:type="gramEnd"/>
-      <w:r>
-        <w:rPr>
-          <w:rFonts w:ascii="Arial" w:hAnsi="Arial" w:cs="Arial"/>
-          <w:sz w:val="24"/>
-          <w:highlight w:val="yellow"/>
-        </w:rPr>
-        <w:t xml:space="preserve"> Acesso em 15 ago. 2006</w:t>
+        <w:t>. Acesso em 15 ago. 2006</w:t>
       </w:r>
     </w:p>
     <w:p>
@@ -11447,21 +11018,12 @@
           <w:highlight w:val="yellow"/>
         </w:rPr>
       </w:pPr>
-      <w:proofErr w:type="spellStart"/>
       <w:r>
         <w:rPr>
           <w:rFonts w:ascii="Arial" w:hAnsi="Arial" w:cs="Arial"/>
           <w:highlight w:val="yellow"/>
         </w:rPr>
-        <w:t>Bibligrafia</w:t>
-      </w:r>
-      <w:proofErr w:type="spellEnd"/>
-      <w:r>
-        <w:rPr>
-          <w:rFonts w:ascii="Arial" w:hAnsi="Arial" w:cs="Arial"/>
-          <w:highlight w:val="yellow"/>
-        </w:rPr>
-        <w:t xml:space="preserve"> com base na ABNT 6023 (</w:t>
+        <w:t>Bibligrafia com base na ABNT 6023 (</w:t>
       </w:r>
       <w:hyperlink r:id="rId13" w:history="1">
         <w:r>
@@ -11680,35 +11242,7 @@
           <w:i/>
           <w:highlight w:val="yellow"/>
         </w:rPr>
-        <w:t xml:space="preserve">Business </w:t>
-      </w:r>
-      <w:proofErr w:type="spellStart"/>
-      <w:proofErr w:type="gramStart"/>
-      <w:r>
-        <w:rPr>
-          <w:rFonts w:ascii="Arial" w:hAnsi="Arial" w:cs="Arial"/>
-          <w:i/>
-          <w:highlight w:val="yellow"/>
-        </w:rPr>
-        <w:t>ModelGeneration</w:t>
-      </w:r>
-      <w:proofErr w:type="spellEnd"/>
-      <w:r>
-        <w:rPr>
-          <w:rFonts w:ascii="Arial" w:hAnsi="Arial" w:cs="Arial"/>
-          <w:i/>
-          <w:highlight w:val="yellow"/>
-        </w:rPr>
-        <w:t xml:space="preserve"> :</w:t>
-      </w:r>
-      <w:proofErr w:type="gramEnd"/>
-      <w:r>
-        <w:rPr>
-          <w:rFonts w:ascii="Arial" w:hAnsi="Arial" w:cs="Arial"/>
-          <w:i/>
-          <w:highlight w:val="yellow"/>
-        </w:rPr>
-        <w:t xml:space="preserve"> Inovação em modelos de negócios. Um manual para visionários, inovadores e revolucionários</w:t>
+        <w:t>Business ModelGeneration : Inovação em modelos de negócios. Um manual para visionários, inovadores e revolucionários</w:t>
       </w:r>
       <w:r>
         <w:rPr>
@@ -11743,18 +11277,8 @@
           <w:i/>
           <w:highlight w:val="yellow"/>
         </w:rPr>
-        <w:t xml:space="preserve">A Startup Enxuta: Como Empreendedores atuais utilizam a inovação contínua para criar empresas extremamente </w:t>
-      </w:r>
-      <w:proofErr w:type="gramStart"/>
-      <w:r>
-        <w:rPr>
-          <w:rFonts w:ascii="Arial" w:hAnsi="Arial" w:cs="Arial"/>
-          <w:i/>
-          <w:highlight w:val="yellow"/>
-        </w:rPr>
-        <w:t>bem sucedidas</w:t>
-      </w:r>
-      <w:proofErr w:type="gramEnd"/>
+        <w:t>A Startup Enxuta: Como Empreendedores atuais utilizam a inovação contínua para criar empresas extremamente bem sucedidas</w:t>
+      </w:r>
       <w:r>
         <w:rPr>
           <w:rFonts w:ascii="Arial" w:hAnsi="Arial" w:cs="Arial"/>
@@ -11804,7 +11328,7 @@
           <w:rFonts w:ascii="Arial" w:hAnsi="Arial"/>
         </w:rPr>
       </w:pPr>
-      <w:bookmarkStart w:id="82" w:name="_Toc238747167"/>
+      <w:bookmarkStart w:id="79" w:name="_Toc238747167"/>
       <w:r>
         <w:rPr>
           <w:rFonts w:ascii="Arial" w:hAnsi="Arial"/>
@@ -11812,7 +11336,7 @@
         <w:lastRenderedPageBreak/>
         <w:t>Apêndice</w:t>
       </w:r>
-      <w:bookmarkEnd w:id="82"/>
+      <w:bookmarkEnd w:id="79"/>
     </w:p>
     <w:p>
       <w:pPr>
@@ -11918,7 +11442,7 @@
           <w:rFonts w:ascii="Arial" w:hAnsi="Arial"/>
         </w:rPr>
       </w:pPr>
-      <w:bookmarkStart w:id="83" w:name="_Toc238747168"/>
+      <w:bookmarkStart w:id="80" w:name="_Toc238747168"/>
       <w:r>
         <w:rPr>
           <w:rFonts w:ascii="Arial" w:hAnsi="Arial"/>
@@ -11926,7 +11450,7 @@
         <w:lastRenderedPageBreak/>
         <w:t>Anexo A</w:t>
       </w:r>
-      <w:bookmarkEnd w:id="83"/>
+      <w:bookmarkEnd w:id="80"/>
     </w:p>
     <w:p>
       <w:pPr>
@@ -12050,7 +11574,7 @@
           <w:rFonts w:ascii="Arial" w:hAnsi="Arial"/>
         </w:rPr>
       </w:pPr>
-      <w:bookmarkStart w:id="84" w:name="_Toc238747169"/>
+      <w:bookmarkStart w:id="81" w:name="_Toc238747169"/>
       <w:r>
         <w:rPr>
           <w:rFonts w:ascii="Arial" w:hAnsi="Arial"/>
@@ -12058,7 +11582,7 @@
         <w:lastRenderedPageBreak/>
         <w:t>Glossário</w:t>
       </w:r>
-      <w:bookmarkEnd w:id="84"/>
+      <w:bookmarkEnd w:id="81"/>
     </w:p>
     <w:p>
       <w:pPr>
@@ -12081,7 +11605,7 @@
           <w:color w:val="0000FF"/>
         </w:rPr>
       </w:pPr>
-      <w:bookmarkStart w:id="85" w:name="_Toc191540290"/>
+      <w:bookmarkStart w:id="82" w:name="_Toc191540290"/>
       <w:r>
         <w:rPr>
           <w:rFonts w:ascii="Arial" w:hAnsi="Arial" w:cs="Arial"/>
@@ -12306,7 +11830,7 @@
           <w:rFonts w:ascii="Arial" w:hAnsi="Arial"/>
         </w:rPr>
       </w:pPr>
-      <w:bookmarkStart w:id="86" w:name="_Toc238747170"/>
+      <w:bookmarkStart w:id="83" w:name="_Toc238747170"/>
       <w:r>
         <w:rPr>
           <w:rFonts w:ascii="Arial" w:hAnsi="Arial"/>
@@ -12314,8 +11838,8 @@
         <w:lastRenderedPageBreak/>
         <w:t>Evidências</w:t>
       </w:r>
-      <w:bookmarkEnd w:id="85"/>
-      <w:bookmarkEnd w:id="86"/>
+      <w:bookmarkEnd w:id="82"/>
+      <w:bookmarkEnd w:id="83"/>
     </w:p>
     <w:p>
       <w:pPr>
@@ -12888,46 +12412,23 @@
           <w:r>
             <w:rPr>
               <w:rFonts w:ascii="Arial" w:hAnsi="Arial" w:cs="Arial"/>
-              <w:color w:val="0000FF"/>
               <w:sz w:val="22"/>
             </w:rPr>
-            <w:t>[</w:t>
+            <w:t>V</w:t>
           </w:r>
-          <w:proofErr w:type="spellStart"/>
           <w:r>
             <w:rPr>
               <w:rFonts w:ascii="Arial" w:hAnsi="Arial" w:cs="Arial"/>
-              <w:color w:val="0000FF"/>
               <w:sz w:val="22"/>
             </w:rPr>
-            <w:t>Cód</w:t>
+            <w:t>C</w:t>
           </w:r>
-          <w:proofErr w:type="spellEnd"/>
           <w:r>
             <w:rPr>
               <w:rFonts w:ascii="Arial" w:hAnsi="Arial" w:cs="Arial"/>
-              <w:color w:val="0000FF"/>
               <w:sz w:val="22"/>
             </w:rPr>
-            <w:t xml:space="preserve"> do </w:t>
-          </w:r>
-          <w:proofErr w:type="spellStart"/>
-          <w:r>
-            <w:rPr>
-              <w:rFonts w:ascii="Arial" w:hAnsi="Arial" w:cs="Arial"/>
-              <w:color w:val="0000FF"/>
-              <w:sz w:val="22"/>
-            </w:rPr>
-            <w:t>Proj</w:t>
-          </w:r>
-          <w:proofErr w:type="spellEnd"/>
-          <w:r>
-            <w:rPr>
-              <w:rFonts w:ascii="Arial" w:hAnsi="Arial" w:cs="Arial"/>
-              <w:color w:val="0000FF"/>
-              <w:sz w:val="22"/>
-            </w:rPr>
-            <w:t>]</w:t>
+            <w:t>-VCN</w:t>
           </w:r>
         </w:p>
       </w:tc>
@@ -13010,31 +12511,10 @@
             <w:rPr>
               <w:rFonts w:ascii="Arial" w:hAnsi="Arial" w:cs="Arial"/>
               <w:b/>
-              <w:color w:val="0000FF"/>
               <w:sz w:val="28"/>
               <w:szCs w:val="28"/>
             </w:rPr>
-            <w:t>[</w:t>
-          </w:r>
-          <w:r>
-            <w:rPr>
-              <w:rFonts w:ascii="Arial" w:hAnsi="Arial" w:cs="Arial"/>
-              <w:b/>
-              <w:color w:val="0000FF"/>
-              <w:sz w:val="28"/>
-              <w:szCs w:val="28"/>
-            </w:rPr>
-            <w:t>Nome do Projeto</w:t>
-          </w:r>
-          <w:r>
-            <w:rPr>
-              <w:rFonts w:ascii="Arial" w:hAnsi="Arial" w:cs="Arial"/>
-              <w:b/>
-              <w:color w:val="0000FF"/>
-              <w:sz w:val="28"/>
-              <w:szCs w:val="28"/>
-            </w:rPr>
-            <w:t>]</w:t>
+            <w:t>VetCare</w:t>
           </w:r>
         </w:p>
       </w:tc>
@@ -13182,36 +12662,30 @@
           <w:r>
             <w:rPr>
               <w:rFonts w:ascii="Arial" w:hAnsi="Arial" w:cs="Arial"/>
-              <w:color w:val="0000FF"/>
               <w:sz w:val="22"/>
             </w:rPr>
-            <w:t>[</w:t>
+            <w:t>TI</w:t>
           </w:r>
           <w:r>
             <w:rPr>
               <w:rFonts w:ascii="Arial" w:hAnsi="Arial" w:cs="Arial"/>
-              <w:color w:val="0000FF"/>
               <w:sz w:val="22"/>
             </w:rPr>
-            <w:t xml:space="preserve">Setor do </w:t>
+            <w:t>-</w:t>
           </w:r>
-          <w:proofErr w:type="spellStart"/>
           <w:r>
             <w:rPr>
               <w:rFonts w:ascii="Arial" w:hAnsi="Arial" w:cs="Arial"/>
-              <w:color w:val="0000FF"/>
               <w:sz w:val="22"/>
             </w:rPr>
-            <w:t>Proj</w:t>
+            <w:t>D</w:t>
           </w:r>
-          <w:proofErr w:type="spellEnd"/>
           <w:r>
             <w:rPr>
               <w:rFonts w:ascii="Arial" w:hAnsi="Arial" w:cs="Arial"/>
-              <w:color w:val="0000FF"/>
               <w:sz w:val="22"/>
             </w:rPr>
-            <w:t>]</w:t>
+            <w:t>SV</w:t>
           </w:r>
         </w:p>
       </w:tc>
@@ -14601,7 +14075,6 @@
   <w:style w:type="character" w:default="1" w:styleId="Fontepargpadro">
     <w:name w:val="Default Paragraph Font"/>
     <w:uiPriority w:val="1"/>
-    <w:semiHidden/>
     <w:unhideWhenUsed/>
   </w:style>
   <w:style w:type="table" w:default="1" w:styleId="Tabelanormal">

</xml_diff>

<commit_message>
Atualização da data de início do projeto.
</commit_message>
<xml_diff>
--- a/ProgramacaoInternet/Projeto/Documentos/VetCare_Projeto-Corporativo.docx
+++ b/ProgramacaoInternet/Projeto/Documentos/VetCare_Projeto-Corporativo.docx
@@ -220,37 +220,8 @@
       <w:r>
         <w:rPr>
           <w:rFonts w:ascii="Arial" w:hAnsi="Arial" w:cs="Arial"/>
-          <w:color w:val="0000FF"/>
-        </w:rPr>
-        <w:t>[</w:t>
-      </w:r>
-      <w:r>
-        <w:rPr>
-          <w:rFonts w:ascii="Arial" w:hAnsi="Arial" w:cs="Arial"/>
-          <w:color w:val="0000FF"/>
-        </w:rPr>
-        <w:t>MM</w:t>
-      </w:r>
-      <w:r>
-        <w:rPr>
-          <w:rFonts w:ascii="Arial" w:hAnsi="Arial" w:cs="Arial"/>
-          <w:color w:val="0000FF"/>
-        </w:rPr>
-        <w:t>/</w:t>
-      </w:r>
-      <w:r>
-        <w:rPr>
-          <w:rFonts w:ascii="Arial" w:hAnsi="Arial" w:cs="Arial"/>
-          <w:color w:val="0000FF"/>
-        </w:rPr>
-        <w:t>AAAA</w:t>
-      </w:r>
-      <w:r>
-        <w:rPr>
-          <w:rFonts w:ascii="Arial" w:hAnsi="Arial" w:cs="Arial"/>
-          <w:color w:val="0000FF"/>
-        </w:rPr>
-        <w:t>]</w:t>
+        </w:rPr>
+        <w:t>08/2026</w:t>
       </w:r>
     </w:p>
     <w:p>
@@ -14397,6 +14368,7 @@
   <w:style w:type="character" w:default="1" w:styleId="Fontepargpadro">
     <w:name w:val="Default Paragraph Font"/>
     <w:uiPriority w:val="1"/>
+    <w:semiHidden/>
     <w:unhideWhenUsed/>
   </w:style>
   <w:style w:type="table" w:default="1" w:styleId="Tabelanormal">

</xml_diff>